<commit_message>
feat : default extensions
</commit_message>
<xml_diff>
--- a/docs/Orbit-Guide.docx
+++ b/docs/Orbit-Guide.docx
@@ -981,6 +981,30 @@
           <w:b w:val="0"/>
         </w:rPr>
         <w:t>Fills in the rest of the settings with the values this project actually runs on.</w:t>
+      </w:r>
+    </w:p>
+    <w:p>
+      <w:pPr>
+        <w:pStyle w:val="ListNumber"/>
+        <w:spacing w:after="100"/>
+      </w:pPr>
+      <w:r>
+        <w:rPr>
+          <w:b w:val="0"/>
+        </w:rPr>
+        <w:t xml:space="preserve">Fetches the default extension and </w:t>
+      </w:r>
+      <w:r>
+        <w:rPr>
+          <w:b/>
+        </w:rPr>
+        <w:t>asks whether you want it installed</w:t>
+      </w:r>
+      <w:r>
+        <w:rPr>
+          <w:b w:val="0"/>
+        </w:rPr>
+        <w:t xml:space="preserve"> - name, version and what it can access. Answer once; it is remembered. Section 3.2 has the detail.</w:t>
       </w:r>
     </w:p>
     <w:p>
@@ -3691,6 +3715,11 @@
       </w:r>
       <w:r>
         <w:t>In a normal browser an extension's popup is a small floating window. Chromium draws those as native desktop windows, outside the page area that is streamed to you - so a floating popup could never appear on your screen. Orbit opens the extension's page as a tab instead. Same page, same buttons, just docked in a tab.</w:t>
+      </w:r>
+    </w:p>
+    <w:p>
+      <w:r>
+        <w:t>One may already be there: Orbit offers a default extension when it starts, and whoever set it up decided whether to accept it. If the Extensions panel is empty, nobody installed anything yet - ask an admin.</w:t>
       </w:r>
     </w:p>
     <w:p>
@@ -4583,6 +4612,315 @@
     <w:p>
       <w:r>
         <w:t>How people then use an extension - and why its popup opens as a tab - is section 2.13, which also explains why some extensions will not work at all. Try them: nothing breaks, and removing one is a click in the Admin panel plus a restart.</w:t>
+      </w:r>
+    </w:p>
+    <w:p>
+      <w:pPr>
+        <w:spacing w:before="160"/>
+      </w:pPr>
+      <w:r>
+        <w:rPr>
+          <w:b/>
+        </w:rPr>
+        <w:t>The default extension</w:t>
+      </w:r>
+    </w:p>
+    <w:p>
+      <w:r>
+        <w:t>Orbit ships with one: DOM Heist, from github.com/Astro-Dude/VibeExtract. Every ./orbit up and ./orbit restart fetches the latest copy and, the first time, asks whether to install it:</w:t>
+      </w:r>
+    </w:p>
+    <w:p>
+      <w:pPr>
+        <w:spacing w:after="0" w:before="0"/>
+        <w:ind w:left="288"/>
+        <w:shd w:val="clear" w:color="auto" w:fill="F2F2F2"/>
+      </w:pPr>
+      <w:r>
+        <w:rPr>
+          <w:rFonts w:ascii="Consolas" w:hAnsi="Consolas"/>
+          <w:sz w:val="19"/>
+        </w:rPr>
+        <w:t>&gt; Orbit ships with a default extension:</w:t>
+      </w:r>
+    </w:p>
+    <w:p>
+      <w:pPr>
+        <w:spacing w:after="0" w:before="0"/>
+        <w:ind w:left="288"/>
+        <w:shd w:val="clear" w:color="auto" w:fill="F2F2F2"/>
+      </w:pPr>
+      <w:r>
+        <w:rPr>
+          <w:rFonts w:ascii="Consolas" w:hAnsi="Consolas"/>
+          <w:sz w:val="19"/>
+        </w:rPr>
+        <w:t xml:space="preserve">    DOM Heist 3.2.0</w:t>
+      </w:r>
+    </w:p>
+    <w:p>
+      <w:pPr>
+        <w:spacing w:after="0" w:before="0"/>
+        <w:ind w:left="288"/>
+        <w:shd w:val="clear" w:color="auto" w:fill="F2F2F2"/>
+      </w:pPr>
+      <w:r>
+        <w:rPr>
+          <w:rFonts w:ascii="Consolas" w:hAnsi="Consolas"/>
+          <w:sz w:val="19"/>
+        </w:rPr>
+        <w:t xml:space="preserve">    from https://github.com/Astro-Dude/VibeExtract.git</w:t>
+      </w:r>
+    </w:p>
+    <w:p>
+      <w:pPr>
+        <w:spacing w:after="0" w:before="0"/>
+        <w:ind w:left="288"/>
+        <w:shd w:val="clear" w:color="auto" w:fill="F2F2F2"/>
+      </w:pPr>
+      <w:r>
+        <w:rPr>
+          <w:rFonts w:ascii="Consolas" w:hAnsi="Consolas"/>
+          <w:sz w:val="19"/>
+        </w:rPr>
+        <w:t xml:space="preserve">    it can: activeTab, scripting, webNavigation, storage, downloads, clipboardWrite</w:t>
+      </w:r>
+    </w:p>
+    <w:p>
+      <w:pPr>
+        <w:spacing w:after="0" w:before="0"/>
+        <w:ind w:left="288"/>
+        <w:shd w:val="clear" w:color="auto" w:fill="F2F2F2"/>
+      </w:pPr>
+      <w:r>
+        <w:rPr>
+          <w:rFonts w:ascii="Consolas" w:hAnsi="Consolas"/>
+          <w:sz w:val="19"/>
+        </w:rPr>
+        <w:t xml:space="preserve">  install it? [Y/n]</w:t>
+      </w:r>
+    </w:p>
+    <w:p>
+      <w:pPr>
+        <w:spacing w:after="40"/>
+      </w:pPr>
+    </w:p>
+    <w:p>
+      <w:pPr>
+        <w:pStyle w:val="ListBullet"/>
+        <w:spacing w:after="60"/>
+      </w:pPr>
+      <w:r>
+        <w:rPr>
+          <w:b w:val="0"/>
+        </w:rPr>
+        <w:t xml:space="preserve">You are asked </w:t>
+      </w:r>
+      <w:r>
+        <w:rPr>
+          <w:b/>
+        </w:rPr>
+        <w:t>once</w:t>
+      </w:r>
+      <w:r>
+        <w:rPr>
+          <w:b w:val="0"/>
+        </w:rPr>
+        <w:t>. The answer is remembered, so starting Orbit never nags.</w:t>
+      </w:r>
+    </w:p>
+    <w:p>
+      <w:pPr>
+        <w:pStyle w:val="ListBullet"/>
+        <w:spacing w:after="60"/>
+      </w:pPr>
+      <w:r>
+        <w:rPr>
+          <w:b w:val="0"/>
+        </w:rPr>
+        <w:t>After that, an update published upstream is installed on the next start without asking, and the browser only restarts when something actually changed.</w:t>
+      </w:r>
+    </w:p>
+    <w:p>
+      <w:pPr>
+        <w:pStyle w:val="ListBullet"/>
+        <w:spacing w:after="60"/>
+      </w:pPr>
+      <w:r>
+        <w:rPr>
+          <w:b w:val="0"/>
+        </w:rPr>
+        <w:t>Say no and it is never installed or asked about again. To be asked afresh, delete .orbit-cache/extensions/&lt;name&gt;.decision</w:t>
+      </w:r>
+    </w:p>
+    <w:p>
+      <w:pPr>
+        <w:pStyle w:val="ListBullet"/>
+        <w:spacing w:after="60"/>
+      </w:pPr>
+      <w:r>
+        <w:rPr>
+          <w:b w:val="0"/>
+        </w:rPr>
+        <w:t>To remove it later: ./orbit ext rm &lt;id&gt;, then restart the browser.</w:t>
+      </w:r>
+    </w:p>
+    <w:p>
+      <w:r>
+        <w:t>To answer in advance, or to change which extensions are offered:</w:t>
+      </w:r>
+    </w:p>
+    <w:tbl>
+      <w:tblPr>
+        <w:tblStyle w:val="LightList-Accent1"/>
+        <w:tblW w:type="auto" w:w="0"/>
+        <w:jc w:val="center"/>
+        <w:tblLook w:firstColumn="1" w:firstRow="1" w:lastColumn="0" w:lastRow="0" w:noHBand="0" w:noVBand="1" w:val="04A0"/>
+      </w:tblPr>
+      <w:tblGrid>
+        <w:gridCol w:w="4824"/>
+        <w:gridCol w:w="4824"/>
+      </w:tblGrid>
+      <w:tr>
+        <w:tc>
+          <w:tcPr>
+            <w:tcW w:type="dxa" w:w="4176"/>
+          </w:tcPr>
+          <w:p>
+            <w:r/>
+            <w:r>
+              <w:rPr>
+                <w:b/>
+              </w:rPr>
+              <w:t>Setting</w:t>
+            </w:r>
+          </w:p>
+        </w:tc>
+        <w:tc>
+          <w:tcPr>
+            <w:tcW w:type="dxa" w:w="5184"/>
+          </w:tcPr>
+          <w:p>
+            <w:r/>
+            <w:r>
+              <w:rPr>
+                <w:b/>
+              </w:rPr>
+              <w:t>Effect</w:t>
+            </w:r>
+          </w:p>
+        </w:tc>
+      </w:tr>
+      <w:tr>
+        <w:tc>
+          <w:tcPr>
+            <w:tcW w:type="dxa" w:w="4176"/>
+          </w:tcPr>
+          <w:p>
+            <w:r/>
+            <w:r>
+              <w:rPr>
+                <w:b w:val="0"/>
+              </w:rPr>
+              <w:t>ORBIT_INSTALL_DEFAULT_EXTENSIONS=yes</w:t>
+            </w:r>
+          </w:p>
+        </w:tc>
+        <w:tc>
+          <w:tcPr>
+            <w:tcW w:type="dxa" w:w="5184"/>
+          </w:tcPr>
+          <w:p>
+            <w:r/>
+            <w:r>
+              <w:rPr>
+                <w:b w:val="0"/>
+              </w:rPr>
+              <w:t>Install without asking - for scripts and unattended machines.</w:t>
+            </w:r>
+          </w:p>
+        </w:tc>
+      </w:tr>
+      <w:tr>
+        <w:tc>
+          <w:tcPr>
+            <w:tcW w:type="dxa" w:w="4176"/>
+          </w:tcPr>
+          <w:p>
+            <w:r/>
+            <w:r>
+              <w:rPr>
+                <w:b w:val="0"/>
+              </w:rPr>
+              <w:t>ORBIT_INSTALL_DEFAULT_EXTENSIONS=no</w:t>
+            </w:r>
+          </w:p>
+        </w:tc>
+        <w:tc>
+          <w:tcPr>
+            <w:tcW w:type="dxa" w:w="5184"/>
+          </w:tcPr>
+          <w:p>
+            <w:r/>
+            <w:r>
+              <w:rPr>
+                <w:b w:val="0"/>
+              </w:rPr>
+              <w:t>Never install, never ask.</w:t>
+            </w:r>
+          </w:p>
+        </w:tc>
+      </w:tr>
+      <w:tr>
+        <w:tc>
+          <w:tcPr>
+            <w:tcW w:type="dxa" w:w="4176"/>
+          </w:tcPr>
+          <w:p>
+            <w:r/>
+            <w:r>
+              <w:rPr>
+                <w:b w:val="0"/>
+              </w:rPr>
+              <w:t>ORBIT_DEFAULT_EXTENSIONS="&lt;git-url&gt; ..."</w:t>
+            </w:r>
+          </w:p>
+        </w:tc>
+        <w:tc>
+          <w:tcPr>
+            <w:tcW w:type="dxa" w:w="5184"/>
+          </w:tcPr>
+          <w:p>
+            <w:r/>
+            <w:r>
+              <w:rPr>
+                <w:b w:val="0"/>
+              </w:rPr>
+              <w:t>Which extensions are offered. Empty means none at all.</w:t>
+            </w:r>
+          </w:p>
+        </w:tc>
+      </w:tr>
+    </w:tbl>
+    <w:p>
+      <w:pPr>
+        <w:spacing w:after="40"/>
+      </w:pPr>
+    </w:p>
+    <w:p>
+      <w:pPr>
+        <w:spacing w:before="160" w:after="200"/>
+        <w:ind w:left="173"/>
+        <w:shd w:val="clear" w:color="auto" w:fill="FFF3CD"/>
+      </w:pPr>
+      <w:r>
+        <w:rPr>
+          <w:b/>
+        </w:rPr>
+        <w:t xml:space="preserve">It never blocks a start  </w:t>
+      </w:r>
+      <w:r>
+        <w:t>An unreachable repository, a missing git, or no terminal to ask at prints a warning and Orbit starts anyway. Nothing is installed without an answer - if there is nowhere to ask, it is skipped.</w:t>
       </w:r>
     </w:p>
     <w:p>

</xml_diff>